<commit_message>
Explortación de parametros para tsne y umap
</commit_message>
<xml_diff>
--- a/TFM_MarioSoto/src/codigo/procesamiento_datos/docs/roadmap_lectura.docx
+++ b/TFM_MarioSoto/src/codigo/procesamiento_datos/docs/roadmap_lectura.docx
@@ -3,446 +3,443 @@
 <w:document xmlns:wpc="http://schemas.microsoft.com/office/word/2010/wordprocessingCanvas" xmlns:cx="http://schemas.microsoft.com/office/drawing/2014/chartex" xmlns:cx1="http://schemas.microsoft.com/office/drawing/2015/9/8/chartex" xmlns:cx2="http://schemas.microsoft.com/office/drawing/2015/10/21/chartex" xmlns:cx3="http://schemas.microsoft.com/office/drawing/2016/5/9/chartex" xmlns:cx4="http://schemas.microsoft.com/office/drawing/2016/5/10/chartex" xmlns:cx5="http://schemas.microsoft.com/office/drawing/2016/5/11/chartex" xmlns:cx6="http://schemas.microsoft.com/office/drawing/2016/5/12/chartex" xmlns:cx7="http://schemas.microsoft.com/office/drawing/2016/5/13/chartex" xmlns:cx8="http://schemas.microsoft.com/office/drawing/2016/5/14/chartex" xmlns:mc="http://schemas.openxmlformats.org/markup-compatibility/2006" xmlns:aink="http://schemas.microsoft.com/office/drawing/2016/ink" xmlns:am3d="http://schemas.microsoft.com/office/drawing/2017/model3d" xmlns:o="urn:schemas-microsoft-com:office:office" xmlns:oel="http://schemas.microsoft.com/office/2019/extlst" xmlns:r="http://schemas.openxmlformats.org/officeDocument/2006/relationships" xmlns:m="http://schemas.openxmlformats.org/officeDocument/2006/math" xmlns:v="urn:schemas-microsoft-com:vml" xmlns:wp14="http://schemas.microsoft.com/office/word/2010/wordprocessingDrawing" xmlns:wp="http://schemas.openxmlformats.org/drawingml/2006/wordprocessingDrawing" xmlns:w10="urn:schemas-microsoft-com:office:word" xmlns:w="http://schemas.openxmlformats.org/wordprocessingml/2006/main" xmlns:w14="http://schemas.microsoft.com/office/word/2010/wordml" xmlns:w15="http://schemas.microsoft.com/office/word/2012/wordml" xmlns:w16cex="http://schemas.microsoft.com/office/word/2018/wordml/cex" xmlns:w16cid="http://schemas.microsoft.com/office/word/2016/wordml/cid" xmlns:w16="http://schemas.microsoft.com/office/word/2018/wordml" xmlns:w16du="http://schemas.microsoft.com/office/word/2023/wordml/word16du" xmlns:w16sdtdh="http://schemas.microsoft.com/office/word/2020/wordml/sdtdatahash" xmlns:w16sdtfl="http://schemas.microsoft.com/office/word/2024/wordml/sdtformatlock" xmlns:w16se="http://schemas.microsoft.com/office/word/2015/wordml/symex" xmlns:wpg="http://schemas.microsoft.com/office/word/2010/wordprocessingGroup" xmlns:wpi="http://schemas.microsoft.com/office/word/2010/wordprocessingInk" xmlns:wne="http://schemas.microsoft.com/office/word/2006/wordml" xmlns:wps="http://schemas.microsoft.com/office/word/2010/wordprocessingShape" mc:Ignorable="w14 w15 w16se w16cid w16 w16cex w16sdtdh w16sdtfl w16du wp14">
   <w:body>
     <w:p>
-      <w:pPr>
-        <w:rPr>
-          <w:b/>
-          <w:bCs/>
-          <w:lang w:val="en-GB"/>
-        </w:rPr>
-      </w:pPr>
-      <w:r>
-        <w:rPr>
-          <w:b/>
-          <w:bCs/>
-          <w:lang w:val="en-GB"/>
-        </w:rPr>
-        <w:t>Designing Data-Intensive Applications — Martin Kleppmann</w:t>
+      <w:proofErr w:type="spellStart"/>
+      <w:r>
+        <w:rPr>
+          <w:b/>
+          <w:bCs/>
+        </w:rPr>
+        <w:t>Designing</w:t>
+      </w:r>
+      <w:proofErr w:type="spellEnd"/>
+      <w:r>
+        <w:rPr>
+          <w:b/>
+          <w:bCs/>
+        </w:rPr>
+        <w:t xml:space="preserve"> Data-Intensive </w:t>
+      </w:r>
+      <w:proofErr w:type="spellStart"/>
+      <w:r>
+        <w:rPr>
+          <w:b/>
+          <w:bCs/>
+        </w:rPr>
+        <w:t>Applications</w:t>
+      </w:r>
+      <w:proofErr w:type="spellEnd"/>
+      <w:r>
+        <w:rPr>
+          <w:b/>
+          <w:bCs/>
+        </w:rPr>
+        <w:t xml:space="preserve"> — Martin </w:t>
+      </w:r>
+      <w:proofErr w:type="spellStart"/>
+      <w:r>
+        <w:rPr>
+          <w:b/>
+          <w:bCs/>
+        </w:rPr>
+        <w:t>Kleppmann</w:t>
+      </w:r>
+      <w:proofErr w:type="spellEnd"/>
+      <w:r>
+        <w:br/>
+        <w:t>• Capítulos esenciales: 1–4 (los otros opcionales)</w:t>
+      </w:r>
+      <w:r>
+        <w:br/>
+        <w:t>• Extensión: ~150 páginas</w:t>
+      </w:r>
+      <w:r>
+        <w:br/>
+        <w:t>• Ritmo recomendado: 30–40 min / sesión, 3–4 sesiones / semana</w:t>
+      </w:r>
+      <w:r>
+        <w:br/>
+        <w:t>• Estimación total: 3–4 semanas para leer.</w:t>
       </w:r>
     </w:p>
     <w:p>
-      <w:pPr>
-        <w:numPr>
-          <w:ilvl w:val="0"/>
-          <w:numId w:val="1"/>
-        </w:numPr>
-      </w:pPr>
-      <w:r>
-        <w:t>Capítulos esenciales: 1–4 (los otros opcionales)</w:t>
+      <w:r>
+        <w:rPr>
+          <w:b/>
+          <w:bCs/>
+        </w:rPr>
+        <w:t xml:space="preserve">Machine </w:t>
+      </w:r>
+      <w:proofErr w:type="spellStart"/>
+      <w:r>
+        <w:rPr>
+          <w:b/>
+          <w:bCs/>
+        </w:rPr>
+        <w:t>Learning</w:t>
+      </w:r>
+      <w:proofErr w:type="spellEnd"/>
+      <w:r>
+        <w:rPr>
+          <w:b/>
+          <w:bCs/>
+        </w:rPr>
+        <w:t xml:space="preserve"> </w:t>
+      </w:r>
+      <w:proofErr w:type="spellStart"/>
+      <w:r>
+        <w:rPr>
+          <w:b/>
+          <w:bCs/>
+        </w:rPr>
+        <w:t>Engineering</w:t>
+      </w:r>
+      <w:proofErr w:type="spellEnd"/>
+      <w:r>
+        <w:rPr>
+          <w:b/>
+          <w:bCs/>
+        </w:rPr>
+        <w:t xml:space="preserve"> — </w:t>
+      </w:r>
+      <w:proofErr w:type="spellStart"/>
+      <w:r>
+        <w:rPr>
+          <w:b/>
+          <w:bCs/>
+        </w:rPr>
+        <w:t>Andriy</w:t>
+      </w:r>
+      <w:proofErr w:type="spellEnd"/>
+      <w:r>
+        <w:rPr>
+          <w:b/>
+          <w:bCs/>
+        </w:rPr>
+        <w:t xml:space="preserve"> </w:t>
+      </w:r>
+      <w:proofErr w:type="spellStart"/>
+      <w:r>
+        <w:rPr>
+          <w:b/>
+          <w:bCs/>
+        </w:rPr>
+        <w:t>Burkov</w:t>
+      </w:r>
+      <w:proofErr w:type="spellEnd"/>
+      <w:r>
+        <w:br/>
+        <w:t>• Capítulos esenciales: 1–2, 4–7 (los otros opcionales)</w:t>
+      </w:r>
+      <w:r>
+        <w:br/>
+        <w:t>• Extensión: ~200 páginas</w:t>
+      </w:r>
+      <w:r>
+        <w:br/>
+        <w:t>• Ritmo recomendado: 30–40 min / sesión, 3–4 sesiones / semana</w:t>
+      </w:r>
+      <w:r>
+        <w:br/>
+        <w:t xml:space="preserve">• Estimación total: 4 semanas para leer y aplicar a pipeline de </w:t>
+      </w:r>
+      <w:proofErr w:type="spellStart"/>
+      <w:r>
+        <w:t>batch</w:t>
+      </w:r>
+      <w:proofErr w:type="spellEnd"/>
+      <w:r>
+        <w:t xml:space="preserve"> y predicción online.</w:t>
       </w:r>
     </w:p>
     <w:p>
-      <w:pPr>
-        <w:numPr>
-          <w:ilvl w:val="0"/>
-          <w:numId w:val="1"/>
-        </w:numPr>
-      </w:pPr>
-      <w:r>
-        <w:t>Extensión: ~150 páginas</w:t>
+      <w:proofErr w:type="spellStart"/>
+      <w:r>
+        <w:rPr>
+          <w:b/>
+          <w:bCs/>
+        </w:rPr>
+        <w:t>Clean</w:t>
+      </w:r>
+      <w:proofErr w:type="spellEnd"/>
+      <w:r>
+        <w:rPr>
+          <w:b/>
+          <w:bCs/>
+        </w:rPr>
+        <w:t xml:space="preserve"> </w:t>
+      </w:r>
+      <w:proofErr w:type="spellStart"/>
+      <w:r>
+        <w:rPr>
+          <w:b/>
+          <w:bCs/>
+        </w:rPr>
+        <w:t>Code</w:t>
+      </w:r>
+      <w:proofErr w:type="spellEnd"/>
+      <w:r>
+        <w:rPr>
+          <w:b/>
+          <w:bCs/>
+        </w:rPr>
+        <w:t xml:space="preserve"> — Robert C. Martin</w:t>
+      </w:r>
+      <w:r>
+        <w:br/>
+        <w:t>• Capítulos esenciales: 1–9</w:t>
+      </w:r>
+      <w:r>
+        <w:br/>
+        <w:t>• Extensión: ~150 páginas</w:t>
+      </w:r>
+      <w:r>
+        <w:br/>
+        <w:t>• Ritmo recomendado: 30 min / sesión, 3–4 sesiones / semana</w:t>
+      </w:r>
+      <w:r>
+        <w:br/>
+        <w:t>• Estimación total: 2–3 semanas.</w:t>
       </w:r>
     </w:p>
     <w:p>
-      <w:pPr>
-        <w:numPr>
-          <w:ilvl w:val="0"/>
-          <w:numId w:val="1"/>
-        </w:numPr>
-      </w:pPr>
-      <w:r>
-        <w:t>Ritmo recomendado: 30–40 min / sesión, 3–4 sesiones / semana</w:t>
+      <w:r>
+        <w:rPr>
+          <w:b/>
+          <w:bCs/>
+        </w:rPr>
+        <w:t xml:space="preserve">Fundamentals </w:t>
+      </w:r>
+      <w:proofErr w:type="spellStart"/>
+      <w:r>
+        <w:rPr>
+          <w:b/>
+          <w:bCs/>
+        </w:rPr>
+        <w:t>of</w:t>
+      </w:r>
+      <w:proofErr w:type="spellEnd"/>
+      <w:r>
+        <w:rPr>
+          <w:b/>
+          <w:bCs/>
+        </w:rPr>
+        <w:t xml:space="preserve"> Data </w:t>
+      </w:r>
+      <w:proofErr w:type="spellStart"/>
+      <w:r>
+        <w:rPr>
+          <w:b/>
+          <w:bCs/>
+        </w:rPr>
+        <w:t>Engineering</w:t>
+      </w:r>
+      <w:proofErr w:type="spellEnd"/>
+      <w:r>
+        <w:rPr>
+          <w:b/>
+          <w:bCs/>
+        </w:rPr>
+        <w:t xml:space="preserve"> — Joe Reis &amp; Matt </w:t>
+      </w:r>
+      <w:proofErr w:type="spellStart"/>
+      <w:r>
+        <w:rPr>
+          <w:b/>
+          <w:bCs/>
+        </w:rPr>
+        <w:t>Housley</w:t>
+      </w:r>
+      <w:proofErr w:type="spellEnd"/>
+      <w:r>
+        <w:br/>
+        <w:t>• Capítulos esenciales: 1–3, 5–7, 9–11 (los otros opcionales)</w:t>
+      </w:r>
+      <w:r>
+        <w:br/>
+        <w:t>• Extensión: ~150 páginas</w:t>
+      </w:r>
+      <w:r>
+        <w:br/>
+        <w:t>• Ritmo recomendado: 30–40 min / sesión, 2–3 sesiones / semana</w:t>
+      </w:r>
+      <w:r>
+        <w:br/>
+        <w:t xml:space="preserve">• Estimación total: 2–3 semanas, leyendo en paralelo con </w:t>
+      </w:r>
+      <w:proofErr w:type="spellStart"/>
+      <w:r>
+        <w:t>Burkov</w:t>
+      </w:r>
+      <w:proofErr w:type="spellEnd"/>
+      <w:r>
+        <w:t xml:space="preserve"> para aplicar pipelines de datos robustos.</w:t>
       </w:r>
     </w:p>
     <w:p>
-      <w:pPr>
-        <w:numPr>
-          <w:ilvl w:val="0"/>
-          <w:numId w:val="1"/>
-        </w:numPr>
-      </w:pPr>
-      <w:r>
-        <w:t>Estimación total: 3–4 semanas para leer.</w:t>
-      </w:r>
-    </w:p>
-    <w:p/>
-    <w:p>
-      <w:pPr>
+      <w:r>
         <w:rPr>
           <w:b/>
           <w:bCs/>
           <w:lang w:val="en-GB"/>
         </w:rPr>
-      </w:pPr>
-      <w:r>
-        <w:rPr>
-          <w:b/>
-          <w:bCs/>
+        <w:t>The DevOps Handbook — Gene Kim et al.</w:t>
+      </w:r>
+      <w:r>
+        <w:rPr>
           <w:lang w:val="en-GB"/>
         </w:rPr>
-        <w:t>Machine Learning Engineering — Andriy Burkov</w:t>
+        <w:br/>
+      </w:r>
+      <w:r>
+        <w:t>• Capítulos esenciales: 1–6</w:t>
+      </w:r>
+      <w:r>
+        <w:br/>
+        <w:t>• Extensión: ~200 páginas</w:t>
+      </w:r>
+      <w:r>
+        <w:br/>
+        <w:t>• Ritmo recomendado: 30–40 min / sesión, 3 sesiones / semana</w:t>
+      </w:r>
+      <w:r>
+        <w:br/>
+        <w:t>• Estimación total: 3–4 semanas para aplicar CI/CD y monitoreo de pipeline.</w:t>
       </w:r>
     </w:p>
     <w:p>
-      <w:pPr>
-        <w:numPr>
-          <w:ilvl w:val="0"/>
-          <w:numId w:val="2"/>
-        </w:numPr>
-      </w:pPr>
-      <w:r>
-        <w:t>Capítulos esenciales: 1–2, 4–7 (los otros opcionales)</w:t>
+      <w:r>
+        <w:rPr>
+          <w:b/>
+          <w:bCs/>
+        </w:rPr>
+        <w:t xml:space="preserve">AWS </w:t>
+      </w:r>
+      <w:proofErr w:type="spellStart"/>
+      <w:r>
+        <w:rPr>
+          <w:b/>
+          <w:bCs/>
+        </w:rPr>
+        <w:t>Well-Architected</w:t>
+      </w:r>
+      <w:proofErr w:type="spellEnd"/>
+      <w:r>
+        <w:rPr>
+          <w:b/>
+          <w:bCs/>
+        </w:rPr>
+        <w:t xml:space="preserve"> Framework (guía oficial)</w:t>
+      </w:r>
+      <w:r>
+        <w:br/>
+        <w:t xml:space="preserve">• Secciones esenciales: </w:t>
+      </w:r>
+      <w:proofErr w:type="spellStart"/>
+      <w:r>
+        <w:t>Operational</w:t>
+      </w:r>
+      <w:proofErr w:type="spellEnd"/>
+      <w:r>
+        <w:t xml:space="preserve"> </w:t>
+      </w:r>
+      <w:proofErr w:type="spellStart"/>
+      <w:r>
+        <w:t>Excellence</w:t>
+      </w:r>
+      <w:proofErr w:type="spellEnd"/>
+      <w:r>
+        <w:t xml:space="preserve">, Security, </w:t>
+      </w:r>
+      <w:proofErr w:type="spellStart"/>
+      <w:r>
+        <w:t>Reliability</w:t>
+      </w:r>
+      <w:proofErr w:type="spellEnd"/>
+      <w:r>
+        <w:br/>
+        <w:t>• Extensión: ~100 páginas</w:t>
+      </w:r>
+      <w:r>
+        <w:br/>
+        <w:t>• Ritmo recomendado: 30 min / sesión, 2–3 sesiones / semana</w:t>
+      </w:r>
+      <w:r>
+        <w:br/>
+        <w:t>• Estimación total: 1–2 semanas para implementar buenas prácticas AWS.</w:t>
       </w:r>
     </w:p>
     <w:p>
-      <w:pPr>
-        <w:numPr>
-          <w:ilvl w:val="0"/>
-          <w:numId w:val="2"/>
-        </w:numPr>
-      </w:pPr>
-      <w:r>
-        <w:t>Extensión: ~200 páginas</w:t>
+      <w:r>
+        <w:rPr>
+          <w:b/>
+          <w:bCs/>
+        </w:rPr>
+        <w:t xml:space="preserve">Fundamentals </w:t>
+      </w:r>
+      <w:proofErr w:type="spellStart"/>
+      <w:r>
+        <w:rPr>
+          <w:b/>
+          <w:bCs/>
+        </w:rPr>
+        <w:t>of</w:t>
+      </w:r>
+      <w:proofErr w:type="spellEnd"/>
+      <w:r>
+        <w:rPr>
+          <w:b/>
+          <w:bCs/>
+        </w:rPr>
+        <w:t xml:space="preserve"> Software </w:t>
+      </w:r>
+      <w:proofErr w:type="spellStart"/>
+      <w:r>
+        <w:rPr>
+          <w:b/>
+          <w:bCs/>
+        </w:rPr>
+        <w:t>Architecture</w:t>
+      </w:r>
+      <w:proofErr w:type="spellEnd"/>
+      <w:r>
+        <w:rPr>
+          <w:b/>
+          <w:bCs/>
+        </w:rPr>
+        <w:t xml:space="preserve"> — Mark Richards, Neal Ford</w:t>
+      </w:r>
+      <w:r>
+        <w:br/>
+        <w:t>• Capítulos esenciales: 1–4, 8–10 (los otros opcionales)</w:t>
+      </w:r>
+      <w:r>
+        <w:br/>
+        <w:t>• Extensión: ~180 páginas</w:t>
+      </w:r>
+      <w:r>
+        <w:br/>
+        <w:t>• Ritmo recomendado: 30–40 min / sesión, 2–3 sesiones / semana</w:t>
+      </w:r>
+      <w:r>
+        <w:br/>
+        <w:t>• Estimación total: 2–3 semanas, leyendo en paralelo con el proyecto.</w:t>
       </w:r>
     </w:p>
     <w:p>
-      <w:pPr>
-        <w:numPr>
-          <w:ilvl w:val="0"/>
-          <w:numId w:val="2"/>
-        </w:numPr>
-      </w:pPr>
-      <w:r>
-        <w:t>Ritmo recomendado: 30–40 min / sesión, 3–4 sesiones / semana</w:t>
+      <w:r>
+        <w:pict w14:anchorId="5814E979">
+          <v:rect id="_x0000_i1037" style="width:0;height:1.5pt" o:hralign="center" o:hrstd="t" o:hr="t" fillcolor="#a0a0a0" stroked="f"/>
+        </w:pict>
       </w:r>
     </w:p>
     <w:p>
-      <w:pPr>
-        <w:numPr>
-          <w:ilvl w:val="0"/>
-          <w:numId w:val="2"/>
-        </w:numPr>
-      </w:pPr>
-      <w:r>
-        <w:t xml:space="preserve">Estimación total: 4 semanas para leer y </w:t>
-      </w:r>
-      <w:r>
-        <w:rPr>
-          <w:b/>
-          <w:bCs/>
-        </w:rPr>
-        <w:t xml:space="preserve">aplicar a pipeline de </w:t>
-      </w:r>
-      <w:proofErr w:type="spellStart"/>
-      <w:r>
-        <w:rPr>
-          <w:b/>
-          <w:bCs/>
-        </w:rPr>
-        <w:t>batch</w:t>
-      </w:r>
-      <w:proofErr w:type="spellEnd"/>
-      <w:r>
-        <w:rPr>
-          <w:b/>
-          <w:bCs/>
-        </w:rPr>
-        <w:t xml:space="preserve"> y predicción online</w:t>
-      </w:r>
-      <w:r>
-        <w:t>.</w:t>
-      </w:r>
-    </w:p>
-    <w:p/>
-    <w:p>
-      <w:pPr>
-        <w:rPr>
-          <w:b/>
-          <w:bCs/>
-          <w:lang w:val="en-GB"/>
-        </w:rPr>
-      </w:pPr>
-      <w:r>
-        <w:rPr>
-          <w:b/>
-          <w:bCs/>
-          <w:lang w:val="en-GB"/>
-        </w:rPr>
-        <w:t>Clean Code — Robert C. Martin</w:t>
-      </w:r>
-    </w:p>
-    <w:p>
-      <w:pPr>
-        <w:numPr>
-          <w:ilvl w:val="0"/>
-          <w:numId w:val="3"/>
-        </w:numPr>
-      </w:pPr>
-      <w:r>
-        <w:t>Capítulos esenciales: 1–9</w:t>
-      </w:r>
-    </w:p>
-    <w:p>
-      <w:pPr>
-        <w:numPr>
-          <w:ilvl w:val="0"/>
-          <w:numId w:val="3"/>
-        </w:numPr>
-      </w:pPr>
-      <w:r>
-        <w:t>Extensión: ~150 páginas</w:t>
-      </w:r>
-    </w:p>
-    <w:p>
-      <w:pPr>
-        <w:numPr>
-          <w:ilvl w:val="0"/>
-          <w:numId w:val="3"/>
-        </w:numPr>
-      </w:pPr>
-      <w:r>
-        <w:t>Ritmo recomendado: 30 min / sesión, 3–4 sesiones / semana</w:t>
-      </w:r>
-    </w:p>
-    <w:p>
-      <w:pPr>
-        <w:numPr>
-          <w:ilvl w:val="0"/>
-          <w:numId w:val="3"/>
-        </w:numPr>
-      </w:pPr>
-      <w:r>
-        <w:t>Estimación total: 2–3 semana</w:t>
-      </w:r>
-      <w:r>
-        <w:t>s</w:t>
-      </w:r>
-      <w:r>
-        <w:t>.</w:t>
-      </w:r>
-    </w:p>
-    <w:p/>
-    <w:p>
-      <w:pPr>
-        <w:rPr>
-          <w:b/>
-          <w:bCs/>
-          <w:lang w:val="en-GB"/>
-        </w:rPr>
-      </w:pPr>
-      <w:r>
-        <w:rPr>
-          <w:b/>
-          <w:bCs/>
-          <w:lang w:val="en-GB"/>
-        </w:rPr>
-        <w:t>The DevOps Handbook — Gene Kim et al.</w:t>
-      </w:r>
-    </w:p>
-    <w:p>
-      <w:pPr>
-        <w:numPr>
-          <w:ilvl w:val="0"/>
-          <w:numId w:val="4"/>
-        </w:numPr>
-      </w:pPr>
-      <w:r>
-        <w:t>Capítulos esenciales: 1–6</w:t>
-      </w:r>
-    </w:p>
-    <w:p>
-      <w:pPr>
-        <w:numPr>
-          <w:ilvl w:val="0"/>
-          <w:numId w:val="4"/>
-        </w:numPr>
-      </w:pPr>
-      <w:r>
-        <w:t>Extensión: ~200 páginas</w:t>
-      </w:r>
-    </w:p>
-    <w:p>
-      <w:pPr>
-        <w:numPr>
-          <w:ilvl w:val="0"/>
-          <w:numId w:val="4"/>
-        </w:numPr>
-      </w:pPr>
-      <w:r>
-        <w:t>Ritmo recomendado: 30–40 min / sesión, 3 sesiones / semana</w:t>
-      </w:r>
-    </w:p>
-    <w:p>
-      <w:pPr>
-        <w:numPr>
-          <w:ilvl w:val="0"/>
-          <w:numId w:val="4"/>
-        </w:numPr>
-      </w:pPr>
-      <w:r>
-        <w:t>Estimación total: 3–4 semanas para aplicar CI/CD y monitoreo de pipeline.</w:t>
-      </w:r>
-    </w:p>
-    <w:p/>
-    <w:p>
-      <w:pPr>
-        <w:rPr>
-          <w:b/>
-          <w:bCs/>
-          <w:lang w:val="en-GB"/>
-        </w:rPr>
-      </w:pPr>
-      <w:r>
-        <w:rPr>
-          <w:b/>
-          <w:bCs/>
-          <w:lang w:val="en-GB"/>
-        </w:rPr>
-        <w:t>AWS Well-Architected Framework (</w:t>
-      </w:r>
-      <w:proofErr w:type="spellStart"/>
-      <w:r>
-        <w:rPr>
-          <w:b/>
-          <w:bCs/>
-          <w:lang w:val="en-GB"/>
-        </w:rPr>
-        <w:t>guía</w:t>
-      </w:r>
-      <w:proofErr w:type="spellEnd"/>
-      <w:r>
-        <w:rPr>
-          <w:b/>
-          <w:bCs/>
-          <w:lang w:val="en-GB"/>
-        </w:rPr>
-        <w:t xml:space="preserve"> </w:t>
-      </w:r>
-      <w:proofErr w:type="spellStart"/>
-      <w:r>
-        <w:rPr>
-          <w:b/>
-          <w:bCs/>
-          <w:lang w:val="en-GB"/>
-        </w:rPr>
-        <w:t>oficial</w:t>
-      </w:r>
-      <w:proofErr w:type="spellEnd"/>
-      <w:r>
-        <w:rPr>
-          <w:b/>
-          <w:bCs/>
-          <w:lang w:val="en-GB"/>
-        </w:rPr>
-        <w:t>)</w:t>
-      </w:r>
-    </w:p>
-    <w:p>
-      <w:pPr>
-        <w:numPr>
-          <w:ilvl w:val="0"/>
-          <w:numId w:val="5"/>
-        </w:numPr>
-      </w:pPr>
-      <w:r>
-        <w:t xml:space="preserve">Secciones esenciales: </w:t>
-      </w:r>
-      <w:proofErr w:type="spellStart"/>
-      <w:r>
-        <w:t>Operational</w:t>
-      </w:r>
-      <w:proofErr w:type="spellEnd"/>
-      <w:r>
-        <w:t xml:space="preserve"> </w:t>
-      </w:r>
-      <w:proofErr w:type="spellStart"/>
-      <w:r>
-        <w:t>Excellence</w:t>
-      </w:r>
-      <w:proofErr w:type="spellEnd"/>
-      <w:r>
-        <w:t xml:space="preserve">, Security, </w:t>
-      </w:r>
-      <w:proofErr w:type="spellStart"/>
-      <w:r>
-        <w:t>Reliability</w:t>
-      </w:r>
-      <w:proofErr w:type="spellEnd"/>
-    </w:p>
-    <w:p>
-      <w:pPr>
-        <w:numPr>
-          <w:ilvl w:val="0"/>
-          <w:numId w:val="5"/>
-        </w:numPr>
-      </w:pPr>
-      <w:r>
-        <w:t>Extensión: ~100 páginas</w:t>
-      </w:r>
-    </w:p>
-    <w:p>
-      <w:pPr>
-        <w:numPr>
-          <w:ilvl w:val="0"/>
-          <w:numId w:val="5"/>
-        </w:numPr>
-      </w:pPr>
-      <w:r>
-        <w:t>Ritmo recomendado: 30 min / sesión, 2–3 sesiones / semana</w:t>
-      </w:r>
-    </w:p>
-    <w:p>
-      <w:pPr>
-        <w:numPr>
-          <w:ilvl w:val="0"/>
-          <w:numId w:val="5"/>
-        </w:numPr>
-      </w:pPr>
-      <w:r>
-        <w:t>Estimación total: 1–2 semanas para implementar buenas prácticas AWS.</w:t>
-      </w:r>
-    </w:p>
-    <w:p/>
-    <w:p>
-      <w:pPr>
-        <w:rPr>
-          <w:b/>
-          <w:bCs/>
-          <w:lang w:val="en-GB"/>
-        </w:rPr>
-      </w:pPr>
-      <w:r>
-        <w:rPr>
-          <w:b/>
-          <w:bCs/>
-          <w:lang w:val="en-GB"/>
-        </w:rPr>
-        <w:t>Fundamentals of Software Architecture — Mark Richards, Neal Ford</w:t>
-      </w:r>
-    </w:p>
-    <w:p>
-      <w:r>
-        <w:lastRenderedPageBreak/>
-        <w:t>• Capítulos esenciales: 1–4, 8–10 (los otros opcionales)</w:t>
-      </w:r>
-      <w:r>
-        <w:br/>
-        <w:t>• Extensión: ~180 páginas</w:t>
-      </w:r>
-      <w:r>
-        <w:br/>
-        <w:t>• Ritmo recomendado: 30–40 min / sesión, 2–3 sesiones / semana</w:t>
-      </w:r>
-      <w:r>
-        <w:br/>
-        <w:t>• Estimación total: 2–3 semanas, leyendo en paralelo con el proyecto</w:t>
-      </w:r>
-    </w:p>
-    <w:p>
-      <w:pPr>
-        <w:rPr>
-          <w:b/>
-          <w:bCs/>
-        </w:rPr>
-      </w:pPr>
+      <w:r>
+        <w:rPr>
+          <w:b/>
+          <w:bCs/>
+        </w:rPr>
+        <w:t>Libro — Semanas aproximadas</w:t>
+      </w:r>
     </w:p>
     <w:tbl>
       <w:tblPr>
@@ -457,7 +454,7 @@
         <w:tblLook w:val="04A0" w:firstRow="1" w:lastRow="0" w:firstColumn="1" w:lastColumn="0" w:noHBand="0" w:noVBand="1"/>
       </w:tblPr>
       <w:tblGrid>
-        <w:gridCol w:w="3655"/>
+        <w:gridCol w:w="3575"/>
         <w:gridCol w:w="2115"/>
       </w:tblGrid>
       <w:tr>
@@ -521,34 +518,16 @@
             <w:hideMark/>
           </w:tcPr>
           <w:p>
-            <w:pPr>
-              <w:rPr>
-                <w:b/>
-                <w:bCs/>
-              </w:rPr>
-            </w:pPr>
             <w:proofErr w:type="spellStart"/>
             <w:r>
-              <w:rPr>
-                <w:b/>
-                <w:bCs/>
-              </w:rPr>
               <w:t>Designing</w:t>
             </w:r>
             <w:proofErr w:type="spellEnd"/>
             <w:r>
-              <w:rPr>
-                <w:b/>
-                <w:bCs/>
-              </w:rPr>
               <w:t xml:space="preserve"> Data-Intensive </w:t>
             </w:r>
             <w:proofErr w:type="spellStart"/>
             <w:r>
-              <w:rPr>
-                <w:b/>
-                <w:bCs/>
-              </w:rPr>
               <w:t>Applications</w:t>
             </w:r>
             <w:proofErr w:type="spellEnd"/>
@@ -561,17 +540,7 @@
             <w:hideMark/>
           </w:tcPr>
           <w:p>
-            <w:pPr>
-              <w:rPr>
-                <w:b/>
-                <w:bCs/>
-              </w:rPr>
-            </w:pPr>
             <w:r>
-              <w:rPr>
-                <w:b/>
-                <w:bCs/>
-              </w:rPr>
               <w:t>3–4</w:t>
             </w:r>
           </w:p>
@@ -588,41 +557,19 @@
             <w:hideMark/>
           </w:tcPr>
           <w:p>
-            <w:pPr>
-              <w:rPr>
-                <w:b/>
-                <w:bCs/>
-              </w:rPr>
-            </w:pPr>
             <w:r>
-              <w:rPr>
-                <w:b/>
-                <w:bCs/>
-              </w:rPr>
               <w:t xml:space="preserve">Machine </w:t>
             </w:r>
             <w:proofErr w:type="spellStart"/>
             <w:r>
-              <w:rPr>
-                <w:b/>
-                <w:bCs/>
-              </w:rPr>
               <w:t>Learning</w:t>
             </w:r>
             <w:proofErr w:type="spellEnd"/>
             <w:r>
-              <w:rPr>
-                <w:b/>
-                <w:bCs/>
-              </w:rPr>
               <w:t xml:space="preserve"> </w:t>
             </w:r>
             <w:proofErr w:type="spellStart"/>
             <w:r>
-              <w:rPr>
-                <w:b/>
-                <w:bCs/>
-              </w:rPr>
               <w:t>Engineering</w:t>
             </w:r>
             <w:proofErr w:type="spellEnd"/>
@@ -635,17 +582,7 @@
             <w:hideMark/>
           </w:tcPr>
           <w:p>
-            <w:pPr>
-              <w:rPr>
-                <w:b/>
-                <w:bCs/>
-              </w:rPr>
-            </w:pPr>
             <w:r>
-              <w:rPr>
-                <w:b/>
-                <w:bCs/>
-              </w:rPr>
               <w:t>4</w:t>
             </w:r>
           </w:p>
@@ -662,34 +599,17 @@
             <w:hideMark/>
           </w:tcPr>
           <w:p>
-            <w:pPr>
-              <w:rPr>
-                <w:b/>
-                <w:bCs/>
-              </w:rPr>
-            </w:pPr>
             <w:proofErr w:type="spellStart"/>
             <w:r>
-              <w:rPr>
-                <w:b/>
-                <w:bCs/>
-              </w:rPr>
+              <w:lastRenderedPageBreak/>
               <w:t>Clean</w:t>
             </w:r>
             <w:proofErr w:type="spellEnd"/>
             <w:r>
-              <w:rPr>
-                <w:b/>
-                <w:bCs/>
-              </w:rPr>
               <w:t xml:space="preserve"> </w:t>
             </w:r>
             <w:proofErr w:type="spellStart"/>
             <w:r>
-              <w:rPr>
-                <w:b/>
-                <w:bCs/>
-              </w:rPr>
               <w:t>Code</w:t>
             </w:r>
             <w:proofErr w:type="spellEnd"/>
@@ -702,17 +622,7 @@
             <w:hideMark/>
           </w:tcPr>
           <w:p>
-            <w:pPr>
-              <w:rPr>
-                <w:b/>
-                <w:bCs/>
-              </w:rPr>
-            </w:pPr>
             <w:r>
-              <w:rPr>
-                <w:b/>
-                <w:bCs/>
-              </w:rPr>
               <w:t>2–3</w:t>
             </w:r>
           </w:p>
@@ -729,42 +639,20 @@
             <w:hideMark/>
           </w:tcPr>
           <w:p>
-            <w:pPr>
-              <w:rPr>
-                <w:b/>
-                <w:bCs/>
-              </w:rPr>
-            </w:pPr>
             <w:r>
-              <w:rPr>
-                <w:b/>
-                <w:bCs/>
-              </w:rPr>
               <w:t xml:space="preserve">Fundamentals </w:t>
             </w:r>
             <w:proofErr w:type="spellStart"/>
             <w:r>
-              <w:rPr>
-                <w:b/>
-                <w:bCs/>
-              </w:rPr>
               <w:t>of</w:t>
             </w:r>
             <w:proofErr w:type="spellEnd"/>
             <w:r>
-              <w:rPr>
-                <w:b/>
-                <w:bCs/>
-              </w:rPr>
-              <w:t xml:space="preserve"> Software </w:t>
+              <w:t xml:space="preserve"> Data </w:t>
             </w:r>
             <w:proofErr w:type="spellStart"/>
             <w:r>
-              <w:rPr>
-                <w:b/>
-                <w:bCs/>
-              </w:rPr>
-              <w:t>Architecture</w:t>
+              <w:t>Engineering</w:t>
             </w:r>
             <w:proofErr w:type="spellEnd"/>
           </w:p>
@@ -776,17 +664,7 @@
             <w:hideMark/>
           </w:tcPr>
           <w:p>
-            <w:pPr>
-              <w:rPr>
-                <w:b/>
-                <w:bCs/>
-              </w:rPr>
-            </w:pPr>
             <w:r>
-              <w:rPr>
-                <w:b/>
-                <w:bCs/>
-              </w:rPr>
               <w:t>2–3</w:t>
             </w:r>
           </w:p>
@@ -803,25 +681,53 @@
             <w:hideMark/>
           </w:tcPr>
           <w:p>
-            <w:pPr>
-              <w:rPr>
-                <w:b/>
-                <w:bCs/>
-              </w:rPr>
-            </w:pPr>
             <w:r>
-              <w:rPr>
-                <w:b/>
-                <w:bCs/>
-              </w:rPr>
+              <w:t xml:space="preserve">Fundamentals </w:t>
+            </w:r>
+            <w:proofErr w:type="spellStart"/>
+            <w:r>
+              <w:t>of</w:t>
+            </w:r>
+            <w:proofErr w:type="spellEnd"/>
+            <w:r>
+              <w:t xml:space="preserve"> Software </w:t>
+            </w:r>
+            <w:proofErr w:type="spellStart"/>
+            <w:r>
+              <w:t>Architecture</w:t>
+            </w:r>
+            <w:proofErr w:type="spellEnd"/>
+          </w:p>
+        </w:tc>
+        <w:tc>
+          <w:tcPr>
+            <w:tcW w:w="0" w:type="auto"/>
+            <w:vAlign w:val="center"/>
+            <w:hideMark/>
+          </w:tcPr>
+          <w:p>
+            <w:r>
+              <w:t>2–3</w:t>
+            </w:r>
+          </w:p>
+        </w:tc>
+      </w:tr>
+      <w:tr>
+        <w:trPr>
+          <w:tblCellSpacing w:w="15" w:type="dxa"/>
+        </w:trPr>
+        <w:tc>
+          <w:tcPr>
+            <w:tcW w:w="0" w:type="auto"/>
+            <w:vAlign w:val="center"/>
+            <w:hideMark/>
+          </w:tcPr>
+          <w:p>
+            <w:r>
               <w:t xml:space="preserve">DevOps </w:t>
             </w:r>
             <w:proofErr w:type="spellStart"/>
             <w:r>
-              <w:rPr>
-                <w:b/>
-                <w:bCs/>
-              </w:rPr>
               <w:t>Handbook</w:t>
             </w:r>
             <w:proofErr w:type="spellEnd"/>
@@ -834,17 +740,7 @@
             <w:hideMark/>
           </w:tcPr>
           <w:p>
-            <w:pPr>
-              <w:rPr>
-                <w:b/>
-                <w:bCs/>
-              </w:rPr>
-            </w:pPr>
             <w:r>
-              <w:rPr>
-                <w:b/>
-                <w:bCs/>
-              </w:rPr>
               <w:t>3–4</w:t>
             </w:r>
           </w:p>
@@ -861,33 +757,15 @@
             <w:hideMark/>
           </w:tcPr>
           <w:p>
-            <w:pPr>
-              <w:rPr>
-                <w:b/>
-                <w:bCs/>
-              </w:rPr>
-            </w:pPr>
             <w:r>
-              <w:rPr>
-                <w:b/>
-                <w:bCs/>
-              </w:rPr>
               <w:t xml:space="preserve">AWS </w:t>
             </w:r>
             <w:proofErr w:type="spellStart"/>
             <w:r>
-              <w:rPr>
-                <w:b/>
-                <w:bCs/>
-              </w:rPr>
               <w:t>Well-Architected</w:t>
             </w:r>
             <w:proofErr w:type="spellEnd"/>
             <w:r>
-              <w:rPr>
-                <w:b/>
-                <w:bCs/>
-              </w:rPr>
               <w:t xml:space="preserve"> Framework</w:t>
             </w:r>
           </w:p>
@@ -899,17 +777,7 @@
             <w:hideMark/>
           </w:tcPr>
           <w:p>
-            <w:pPr>
-              <w:rPr>
-                <w:b/>
-                <w:bCs/>
-              </w:rPr>
-            </w:pPr>
             <w:r>
-              <w:rPr>
-                <w:b/>
-                <w:bCs/>
-              </w:rPr>
               <w:t>1–2</w:t>
             </w:r>
           </w:p>
@@ -917,75 +785,50 @@
       </w:tr>
     </w:tbl>
     <w:p>
-      <w:pPr>
-        <w:rPr>
-          <w:b/>
-          <w:bCs/>
-        </w:rPr>
-      </w:pPr>
+      <w:proofErr w:type="gramStart"/>
+      <w:r>
+        <w:rPr>
+          <w:b/>
+          <w:bCs/>
+        </w:rPr>
+        <w:t>Total</w:t>
+      </w:r>
+      <w:proofErr w:type="gramEnd"/>
+      <w:r>
+        <w:rPr>
+          <w:b/>
+          <w:bCs/>
+        </w:rPr>
+        <w:t xml:space="preserve"> acumulado:</w:t>
+      </w:r>
+      <w:r>
+        <w:t xml:space="preserve"> 17–23 semanas (~4–5 meses)</w:t>
+      </w:r>
     </w:p>
+    <w:p/>
     <w:p>
-      <w:proofErr w:type="gramStart"/>
-      <w:r>
-        <w:rPr>
-          <w:b/>
-          <w:bCs/>
-        </w:rPr>
-        <w:t>Total</w:t>
-      </w:r>
-      <w:proofErr w:type="gramEnd"/>
-      <w:r>
-        <w:rPr>
-          <w:b/>
-          <w:bCs/>
-        </w:rPr>
-        <w:t xml:space="preserve"> acumulado: 15–20 semanas (~4–5 meses)</w:t>
-      </w:r>
-      <w:r>
-        <w:rPr>
-          <w:b/>
-          <w:bCs/>
-        </w:rPr>
-        <w:br/>
-      </w:r>
-    </w:p>
-    <w:p>
-      <w:pPr>
-        <w:rPr>
-          <w:b/>
-          <w:bCs/>
-          <w:sz w:val="26"/>
-          <w:szCs w:val="26"/>
-        </w:rPr>
-      </w:pPr>
-      <w:r>
-        <w:rPr>
-          <w:b/>
-          <w:bCs/>
-          <w:sz w:val="26"/>
-          <w:szCs w:val="26"/>
+      <w:r>
+        <w:rPr>
+          <w:b/>
+          <w:bCs/>
         </w:rPr>
         <w:t>Lectura + aplicación incremental:</w:t>
       </w:r>
-    </w:p>
-    <w:p>
-      <w:pPr>
-        <w:numPr>
-          <w:ilvl w:val="0"/>
-          <w:numId w:val="7"/>
-        </w:numPr>
-      </w:pPr>
-      <w:r>
+      <w:r>
+        <w:br/>
+        <w:t xml:space="preserve">• </w:t>
+      </w:r>
+      <w:r>
+        <w:rPr>
+          <w:b/>
+          <w:bCs/>
+        </w:rPr>
         <w:t>Enero–Febrero:</w:t>
       </w:r>
-    </w:p>
-    <w:p>
-      <w:pPr>
-        <w:numPr>
-          <w:ilvl w:val="1"/>
-          <w:numId w:val="7"/>
-        </w:numPr>
-      </w:pPr>
+      <w:r>
+        <w:br/>
+        <w:t xml:space="preserve">o </w:t>
+      </w:r>
       <w:proofErr w:type="spellStart"/>
       <w:r>
         <w:t>Kleppmann</w:t>
@@ -1007,16 +850,9 @@
         <w:t>Code</w:t>
       </w:r>
       <w:proofErr w:type="spellEnd"/>
-    </w:p>
-    <w:p>
-      <w:pPr>
-        <w:numPr>
-          <w:ilvl w:val="1"/>
-          <w:numId w:val="7"/>
-        </w:numPr>
-      </w:pPr>
-      <w:r>
-        <w:t xml:space="preserve">(pipeline manual, </w:t>
+      <w:r>
+        <w:br/>
+        <w:t xml:space="preserve">o (pipeline manual, </w:t>
       </w:r>
       <w:proofErr w:type="spellStart"/>
       <w:r>
@@ -1026,70 +862,68 @@
       <w:r>
         <w:t xml:space="preserve"> inicial, datos bien separados)</w:t>
       </w:r>
-    </w:p>
-    <w:p>
-      <w:pPr>
-        <w:numPr>
-          <w:ilvl w:val="0"/>
-          <w:numId w:val="7"/>
-        </w:numPr>
-      </w:pPr>
-      <w:r>
+      <w:r>
+        <w:br/>
+        <w:t xml:space="preserve">• </w:t>
+      </w:r>
+      <w:r>
+        <w:rPr>
+          <w:b/>
+          <w:bCs/>
+        </w:rPr>
         <w:t>Febrero–Marzo:</w:t>
       </w:r>
-    </w:p>
-    <w:p>
-      <w:pPr>
-        <w:numPr>
-          <w:ilvl w:val="1"/>
-          <w:numId w:val="7"/>
-        </w:numPr>
-      </w:pPr>
+      <w:r>
+        <w:br/>
+        <w:t xml:space="preserve">o </w:t>
+      </w:r>
       <w:proofErr w:type="spellStart"/>
       <w:r>
         <w:t>Burkov</w:t>
       </w:r>
       <w:proofErr w:type="spellEnd"/>
-    </w:p>
-    <w:p>
-      <w:pPr>
-        <w:numPr>
-          <w:ilvl w:val="1"/>
-          <w:numId w:val="7"/>
-        </w:numPr>
-      </w:pPr>
-      <w:r>
-        <w:t>(</w:t>
+      <w:r>
+        <w:t xml:space="preserve"> + Fundamentals </w:t>
       </w:r>
       <w:proofErr w:type="spellStart"/>
       <w:r>
+        <w:t>of</w:t>
+      </w:r>
+      <w:proofErr w:type="spellEnd"/>
+      <w:r>
+        <w:t xml:space="preserve"> Data </w:t>
+      </w:r>
+      <w:proofErr w:type="spellStart"/>
+      <w:r>
+        <w:t>Engineering</w:t>
+      </w:r>
+      <w:proofErr w:type="spellEnd"/>
+      <w:r>
+        <w:br/>
+        <w:t>o (</w:t>
+      </w:r>
+      <w:proofErr w:type="spellStart"/>
+      <w:r>
         <w:t>features</w:t>
       </w:r>
       <w:proofErr w:type="spellEnd"/>
       <w:r>
-        <w:t>, entrenamiento offline, métricas)</w:t>
-      </w:r>
-    </w:p>
-    <w:p>
-      <w:pPr>
-        <w:numPr>
-          <w:ilvl w:val="0"/>
-          <w:numId w:val="7"/>
-        </w:numPr>
-      </w:pPr>
-      <w:r>
+        <w:t>, entrenamiento offline, pipelines robustos, métricas)</w:t>
+      </w:r>
+      <w:r>
+        <w:br/>
+        <w:t xml:space="preserve">• </w:t>
+      </w:r>
+      <w:r>
+        <w:rPr>
+          <w:b/>
+          <w:bCs/>
+        </w:rPr>
         <w:t>Marzo:</w:t>
       </w:r>
-    </w:p>
-    <w:p>
-      <w:pPr>
-        <w:numPr>
-          <w:ilvl w:val="1"/>
-          <w:numId w:val="7"/>
-        </w:numPr>
-      </w:pPr>
-      <w:r>
-        <w:t xml:space="preserve">Fundamentals </w:t>
+      <w:r>
+        <w:br/>
+        <w:t xml:space="preserve">o Fundamentals </w:t>
       </w:r>
       <w:proofErr w:type="spellStart"/>
       <w:r>
@@ -1104,38 +938,24 @@
         <w:t>Architecture</w:t>
       </w:r>
       <w:proofErr w:type="spellEnd"/>
-    </w:p>
-    <w:p>
-      <w:pPr>
-        <w:numPr>
-          <w:ilvl w:val="1"/>
-          <w:numId w:val="7"/>
-        </w:numPr>
-      </w:pPr>
-      <w:r>
-        <w:t>(ordenar capas, decisiones arquitectónicas)</w:t>
-      </w:r>
-    </w:p>
-    <w:p>
-      <w:pPr>
-        <w:numPr>
-          <w:ilvl w:val="0"/>
-          <w:numId w:val="7"/>
-        </w:numPr>
-      </w:pPr>
-      <w:r>
+      <w:r>
+        <w:br/>
+        <w:t>o (ordenar capas, decisiones arquitectónicas)</w:t>
+      </w:r>
+      <w:r>
+        <w:br/>
+        <w:t xml:space="preserve">• </w:t>
+      </w:r>
+      <w:r>
+        <w:rPr>
+          <w:b/>
+          <w:bCs/>
+        </w:rPr>
         <w:t>Abril:</w:t>
       </w:r>
-    </w:p>
-    <w:p>
-      <w:pPr>
-        <w:numPr>
-          <w:ilvl w:val="1"/>
-          <w:numId w:val="7"/>
-        </w:numPr>
-      </w:pPr>
-      <w:r>
-        <w:t xml:space="preserve">DevOps </w:t>
+      <w:r>
+        <w:br/>
+        <w:t xml:space="preserve">o DevOps </w:t>
       </w:r>
       <w:proofErr w:type="spellStart"/>
       <w:r>
@@ -1150,55 +970,9 @@
         <w:t>Well-Architected</w:t>
       </w:r>
       <w:proofErr w:type="spellEnd"/>
-    </w:p>
-    <w:p>
-      <w:pPr>
-        <w:numPr>
-          <w:ilvl w:val="1"/>
-          <w:numId w:val="7"/>
-        </w:numPr>
-      </w:pPr>
-      <w:r>
-        <w:t>(automatización, producción)</w:t>
-      </w:r>
-    </w:p>
-    <w:p>
-      <w:r>
-        <w:t>Así:</w:t>
-      </w:r>
-    </w:p>
-    <w:p>
-      <w:pPr>
-        <w:numPr>
-          <w:ilvl w:val="0"/>
-          <w:numId w:val="8"/>
-        </w:numPr>
-      </w:pPr>
-      <w:r>
-        <w:t>No te bloqueas leyendo</w:t>
-      </w:r>
-    </w:p>
-    <w:p>
-      <w:pPr>
-        <w:numPr>
-          <w:ilvl w:val="0"/>
-          <w:numId w:val="8"/>
-        </w:numPr>
-      </w:pPr>
-      <w:r>
-        <w:t>Cada capítulo mejora algo real de tu sistema</w:t>
-      </w:r>
-    </w:p>
-    <w:p>
-      <w:pPr>
-        <w:numPr>
-          <w:ilvl w:val="0"/>
-          <w:numId w:val="8"/>
-        </w:numPr>
-      </w:pPr>
-      <w:r>
-        <w:lastRenderedPageBreak/>
-        <w:t>Llegas a junio con un MVP defendible</w:t>
+      <w:r>
+        <w:br/>
+        <w:t>o (automatización, producción)</w:t>
       </w:r>
     </w:p>
     <w:p/>

</xml_diff>